<commit_message>
docs: personal frameworks in QA 07 / 05, the UAT guide and the Pivot-Plan
- QA module 07 §7.4a: TC-PG-050 to TC-PG-056 (customise before Start,
  draft sync, approved sheets, custom weights, revert, markers and locks,
  past-year lock); TC-PG-040 / 041 and the notifications table updated
- QA 05 cross-checks: Admin-only, Users-tab lock
- UAT guide (+ Word copy): Project Goals rule, chip, Admin Panel rows
- Pivot-Plan revision, 16 Oct 2026
</commit_message>
<xml_diff>
--- a/miltenyi-pms-dev/docs/Miltenyi-PMS-UAT-Guide.docx
+++ b/miltenyi-pms-dev/docs/Miltenyi-PMS-UAT-Guide.docx
@@ -2237,6 +2237,115 @@
           </w:p>
         </w:tc>
       </w:tr>
+      <w:tr>
+        <w:trPr>
+          <w:cantSplit/>
+          <w:tblHeader w:val="off"/>
+        </w:trPr>
+        <w:tc>
+          <w:tcPr>
+            <w:tcW w:type="dxa" w:w="2621"/>
+            <w:tcBorders>
+              <w:top w:val="single" w:color="BFBFBF" w:sz="4"/>
+              <w:left w:val="single" w:color="BFBFBF" w:sz="4"/>
+              <w:bottom w:val="single" w:color="BFBFBF" w:sz="4"/>
+              <w:right w:val="single" w:color="BFBFBF" w:sz="4"/>
+            </w:tcBorders>
+            <w:tcMar>
+              <w:top w:type="dxa" w:w="60"/>
+              <w:left w:type="dxa" w:w="90"/>
+              <w:bottom w:type="dxa" w:w="60"/>
+              <w:right w:type="dxa" w:w="90"/>
+            </w:tcMar>
+          </w:tcPr>
+          <w:p>
+            <w:pPr>
+              <w:spacing w:after="0" w:before="0"/>
+            </w:pPr>
+            <w:r>
+              <w:rPr>
+                <w:sz w:val="18"/>
+                <w:szCs w:val="18"/>
+              </w:rPr>
+              <w:t xml:space="preserve">Customise one person's framework (personal framework)</w:t>
+            </w:r>
+          </w:p>
+        </w:tc>
+        <w:tc>
+          <w:tcPr>
+            <w:tcW w:type="dxa" w:w="1872"/>
+            <w:tcBorders>
+              <w:top w:val="single" w:color="BFBFBF" w:sz="4"/>
+              <w:left w:val="single" w:color="BFBFBF" w:sz="4"/>
+              <w:bottom w:val="single" w:color="BFBFBF" w:sz="4"/>
+              <w:right w:val="single" w:color="BFBFBF" w:sz="4"/>
+            </w:tcBorders>
+            <w:tcMar>
+              <w:top w:type="dxa" w:w="60"/>
+              <w:left w:type="dxa" w:w="90"/>
+              <w:bottom w:type="dxa" w:w="60"/>
+              <w:right w:type="dxa" w:w="90"/>
+            </w:tcMar>
+          </w:tcPr>
+          <w:p>
+            <w:pPr>
+              <w:spacing w:after="0" w:before="0"/>
+            </w:pPr>
+            <w:r>
+              <w:rPr>
+                <w:sz w:val="18"/>
+                <w:szCs w:val="18"/>
+              </w:rPr>
+              <w:t xml:space="preserve">Admin</w:t>
+            </w:r>
+          </w:p>
+        </w:tc>
+        <w:tc>
+          <w:tcPr>
+            <w:tcW w:type="dxa" w:w="4867"/>
+            <w:tcBorders>
+              <w:top w:val="single" w:color="BFBFBF" w:sz="4"/>
+              <w:left w:val="single" w:color="BFBFBF" w:sz="4"/>
+              <w:bottom w:val="single" w:color="BFBFBF" w:sz="4"/>
+              <w:right w:val="single" w:color="BFBFBF" w:sz="4"/>
+            </w:tcBorders>
+            <w:tcMar>
+              <w:top w:type="dxa" w:w="60"/>
+              <w:left w:type="dxa" w:w="90"/>
+              <w:bottom w:type="dxa" w:w="60"/>
+              <w:right w:type="dxa" w:w="90"/>
+            </w:tcMar>
+          </w:tcPr>
+          <w:p>
+            <w:pPr>
+              <w:spacing w:after="0" w:before="0"/>
+            </w:pPr>
+            <w:r>
+              <w:rPr>
+                <w:sz w:val="18"/>
+                <w:szCs w:val="18"/>
+              </w:rPr>
+              <w:t xml:space="preserve">active goal year; the person has a function, a level and a framework column. Applies to their sheet at once (goal text and reviews stay on their rows); KPIs can be added or removed until their goals are approved, after that only texts and weightages. </w:t>
+            </w:r>
+            <w:r>
+              <w:rPr>
+                <w:b/>
+                <w:bCs/>
+                <w:sz w:val="18"/>
+                <w:szCs w:val="18"/>
+              </w:rPr>
+              <w:t xml:space="preserve">Revert to standard</w:t>
+            </w:r>
+            <w:r>
+              <w:rPr>
+                <w:sz w:val="18"/>
+                <w:szCs w:val="18"/>
+              </w:rPr>
+              <w:t xml:space="preserve"> goes back to the column</w:t>
+            </w:r>
+          </w:p>
+        </w:tc>
+      </w:tr>
     </w:tbl>
     <w:p>
       <w:pPr>
@@ -2269,6 +2378,50 @@
           <w:szCs w:val="21"/>
         </w:rPr>
         <w:t xml:space="preserve"> is on. The Team Goals and All Goals queues show every sheet's state per quarter and let the Admin filter by function, level and mentor.</w:t>
+      </w:r>
+    </w:p>
+    <w:p>
+      <w:pPr>
+        <w:spacing w:after="120"/>
+      </w:pPr>
+      <w:r>
+        <w:rPr>
+          <w:sz w:val="21"/>
+          <w:szCs w:val="21"/>
+        </w:rPr>
+        <w:t xml:space="preserve">A personal framework shows a </w:t>
+      </w:r>
+      <w:r>
+        <w:rPr>
+          <w:b/>
+          <w:bCs/>
+          <w:sz w:val="21"/>
+          <w:szCs w:val="21"/>
+        </w:rPr>
+        <w:t xml:space="preserve">Personalised</w:t>
+      </w:r>
+      <w:r>
+        <w:rPr>
+          <w:sz w:val="21"/>
+          <w:szCs w:val="21"/>
+        </w:rPr>
+        <w:t xml:space="preserve"> chip on the framework band (for the staff member, the mentor and the Admin), in the queues and on Framework Mapping. It belongs to one goal year: the next year starts from the column again, and the editor offers </w:t>
+      </w:r>
+      <w:r>
+        <w:rPr>
+          <w:b/>
+          <w:bCs/>
+          <w:sz w:val="21"/>
+          <w:szCs w:val="21"/>
+        </w:rPr>
+        <w:t xml:space="preserve">Copy last year's</w:t>
+      </w:r>
+      <w:r>
+        <w:rPr>
+          <w:sz w:val="21"/>
+          <w:szCs w:val="21"/>
+        </w:rPr>
+        <w:t xml:space="preserve">. Past goal years are locked; their framework cannot be edited.</w:t>
       </w:r>
     </w:p>
     <w:p>
@@ -5072,7 +5225,7 @@
           <w:sz w:val="21"/>
           <w:szCs w:val="21"/>
         </w:rPr>
-        <w:t xml:space="preserve"> fires per event: a goal submitted, approved or sent back, a self-review or review submitted, a mentor's nudge, every quarter move, every Admin announcement. It also shows live alerts (drafts not submitted, goals awaiting a mentor's approval) and an Announcements tab for paused switches and a changed cycle.</w:t>
+        <w:t xml:space="preserve"> fires per event: a goal submitted, approved or sent back, a self-review or review submitted, a mentor's nudge, every quarter move, every Admin announcement, and a personal framework saved or reverted (to the staff member and their mentor). It also shows live alerts (drafts not submitted, goals awaiting a mentor's approval) and an Announcements tab for paused switches and a changed cycle.</w:t>
       </w:r>
     </w:p>
     <w:p>
@@ -5468,7 +5621,7 @@
                 <w:sz w:val="18"/>
                 <w:szCs w:val="18"/>
               </w:rPr>
-              <w:t xml:space="preserve">Function, designation (level), mentor and Miltenyi reviewer per person</w:t>
+              <w:t xml:space="preserve">Function, designation (level), mentor and Miltenyi reviewer per person; the person icon customises that person's framework for the year</w:t>
             </w:r>
           </w:p>
         </w:tc>
@@ -5497,7 +5650,7 @@
                 <w:sz w:val="18"/>
                 <w:szCs w:val="18"/>
               </w:rPr>
-              <w:t xml:space="preserve">Function and designation are locked while the person has a goal sheet in the active goal year (409); change them between years</w:t>
+              <w:t xml:space="preserve">Function and designation are locked while the person has a goal sheet in the active goal year (409), or a personal framework (revert it first); change them between years</w:t>
             </w:r>
           </w:p>
         </w:tc>
@@ -5561,7 +5714,7 @@
                 <w:sz w:val="18"/>
                 <w:szCs w:val="18"/>
               </w:rPr>
-              <w:t xml:space="preserve">The goal themes per function × level: title, two paragraphs, KPIs with weightages, and the pinned Additional goals row whose weightage is editable but never deleted; KPIs plus that row total 100. Add functions, designations and levels</w:t>
+              <w:t xml:space="preserve">The goal themes per function × level: title, two paragraphs, KPIs with weightages, and the pinned Additional goals row whose weightage is editable but never deleted; KPIs plus that row total 100. Add functions, designations and levels. Under the matrix, the year's personal frameworks with Edit and Revert</w:t>
             </w:r>
           </w:p>
         </w:tc>
@@ -5590,7 +5743,7 @@
                 <w:sz w:val="18"/>
                 <w:szCs w:val="18"/>
               </w:rPr>
-              <w:t xml:space="preserve">Staged Save. A function without rows (Pharmacovigilance today) shows its staff "no framework yet" until rows are added</w:t>
+              <w:t xml:space="preserve">Staged Save. A function without rows (Pharmacovigilance today) shows its staff "no framework yet" until rows are added. A past goal year's framework is read-only</w:t>
             </w:r>
           </w:p>
         </w:tc>

</xml_diff>

<commit_message>
feat(admin): text labels on Framework Mapping actions
The row actions read "Personalise framework" and "Edit" next to their icons instead of icons alone; the actions column is wider to fit them. QA 07, the UAT guide (+ Word copy) and the Pivot-Plan name the button instead of "the person icon".
</commit_message>
<xml_diff>
--- a/miltenyi-pms-dev/docs/Miltenyi-PMS-UAT-Guide.docx
+++ b/miltenyi-pms-dev/docs/Miltenyi-PMS-UAT-Guide.docx
@@ -5621,7 +5621,23 @@
                 <w:sz w:val="18"/>
                 <w:szCs w:val="18"/>
               </w:rPr>
-              <w:t xml:space="preserve">Function, designation (level), mentor and Miltenyi reviewer per person; the person icon customises that person's framework for the year</w:t>
+              <w:t xml:space="preserve">Function, designation (level), mentor and Miltenyi reviewer per person; </w:t>
+            </w:r>
+            <w:r>
+              <w:rPr>
+                <w:b/>
+                <w:bCs/>
+                <w:sz w:val="18"/>
+                <w:szCs w:val="18"/>
+              </w:rPr>
+              <w:t xml:space="preserve">Personalise framework</w:t>
+            </w:r>
+            <w:r>
+              <w:rPr>
+                <w:sz w:val="18"/>
+                <w:szCs w:val="18"/>
+              </w:rPr>
+              <w:t xml:space="preserve"> gives that person their own framework for the year</w:t>
             </w:r>
           </w:p>
         </w:tc>

</xml_diff>